<commit_message>
2В1: address shared bracket candidates without assigning mounting restraints
Reproduce the actual engine/producer gap, add bounded ID diagnostics to the shared table, preserve physical quantities and engineering refusals, and add Windows UI coverage. Record source review, local gates, synthetic runs and the updated guide. Windows verification follows; no installer release.
</commit_message>
<xml_diff>
--- a/docs/facades_beginner_3009/Facades_Beginner_Manual_30.09.docx
+++ b/docs/facades_beginner_3009/Facades_Beginner_Manual_30.09.docx
@@ -48,7 +48,7 @@
         <w:rPr>
           <w:b/>
         </w:rPr>
-        <w:t>Редакция для исходников после build-bundle #104. Этапы 2Б1–2Б5 ещё не входят в установочный выпуск. Перед занятием проверьте версию трёх бандлов по разделу «Какой версией пользоваться».</w:t>
+        <w:t>Редакция для исходников после build-bundle #104. Этапы 2Б1–2Б5 и 2В1 ещё не входят в установочный выпуск. Перед занятием проверьте версию трёх бандлов по разделу «Какой версией пользоваться».</w:t>
       </w:r>
     </w:p>
     <w:p>
@@ -357,7 +357,7 @@
         <w:rPr>
           <w:b/>
         </w:rPr>
-        <w:t>Эта редакция описывает исходники после build-bundle #104, включая этапы 2Б1, 2Б2, размерную схему ATFNODE этапа 2Б3 и монтажный отчёт 2Б4 с частичной номинальной цепью 2Б5. Выбор решения, параметры проекта и зон, а также ATFNODE из главы 13 ещё не входят в установочный выпуск.</w:t>
+        <w:t>Эта редакция описывает исходники после build-bundle #104: этапы 2Б1–2Б5 главы 13 и адресные предупреждения о кандидатах-кронштейнах 2В1 в разделе 8.9. Эти изменения ещё не входят в установочный выпуск.</w:t>
       </w:r>
       <w:r>
         <w:t xml:space="preserve"> Выпуск #104 содержит этап 2А: ведомости и геометрический паспорт соединений. Для него сохранено отдельное </w:t>
@@ -396,7 +396,7 @@
         <w:t>latest</w:t>
       </w:r>
       <w:r>
-        <w:t xml:space="preserve"> соответствующим этой редакции. До отдельного выпуска 2Б1–2Б5 изучайте новые поля по инструкции; доступность окна в исходниках не доказывает его работу в живом AutoCAD. Идентификатор проверенного кода приведён в </w:t>
+        <w:t xml:space="preserve"> соответствующим этой редакции. До отдельного выпуска 2Б1–2Б5 и 2В1 изучайте новые поля и сообщения по инструкции; доступность окна в исходниках не доказывает его работу в живом AutoCAD. Идентификатор проверенного кода приведён в </w:t>
       </w:r>
       <w:r>
         <w:rPr>
@@ -9168,6 +9168,26 @@
     </w:p>
     <w:p>
       <w:r>
+        <w:rPr>
+          <w:b/>
+        </w:rPr>
+        <w:t>В исходниках после build-104</w:t>
+      </w:r>
+      <w:r>
+        <w:t xml:space="preserve"> один физический кронштейн, попавший в кандидаты нескольких отдельных кусков ГП, получает адресное предупреждение </w:t>
+      </w:r>
+      <w:r>
+        <w:rPr>
+          <w:b/>
+        </w:rPr>
+        <w:t>«Монтажная принадлежность не определена»</w:t>
+      </w:r>
+      <w:r>
+        <w:t>. В строках затронутых направляющих показано число общих кандидатов-кронштейнов; в предупреждениях отчёта — ID кронштейна и всех связанных направляющих. Это неоднозначность геометрической схемы, а не установленная ошибка монтажа или назначенная опора. Сопоставьте перечисленные детали с проектным узлом; не удаляйте их ради исчезновения сообщения.</w:t>
+      </w:r>
+    </w:p>
+    <w:p>
+      <w:r>
         <w:t xml:space="preserve">Неподвижность или подвижность соединения и непрерывность профиля через стык остаются </w:t>
       </w:r>
       <w:r>
@@ -9177,7 +9197,7 @@
         <w:t>неизвестными</w:t>
       </w:r>
       <w:r>
-        <w:t>, пока не подтверждены проектным решением. Соседние куски профиля не объединяются в непрерывный элемент по одному совпадению координат. Марка или выбор предустановки «Вектор-1» также не присваивает изделию подтверждённую позицию каталога. Данные одного первичного расчёта относятся к его собственному решению, а не ко всем фасадам этой системы.</w:t>
+        <w:t>, пока не подтверждены проектным решением. Даже нулевой зазор между соседними кусками не объединяет их в непрерывный элемент. Марка или выбор предустановки «Вектор-1» также не присваивает изделию подтверждённую позицию каталога. Данные одного первичного расчёта относятся к его собственному решению, а не ко всем фасадам этой системы. Адресное предупреждение не завершает монтажный контракт и не открывает полный расчёт или автоподбор.</w:t>
       </w:r>
     </w:p>
     <w:p>
@@ -9200,14 +9220,14 @@
       </w:r>
     </w:p>
     <w:p>
-      <w:bookmarkStart w:id="406" w:name="chapter_10"/>
+      <w:bookmarkStart w:id="408" w:name="chapter_10"/>
       <w:pPr>
         <w:pStyle w:val="Heading1"/>
       </w:pPr>
       <w:r>
         <w:t>9 Как проверять весь фасад не запутавшись в слоях</w:t>
       </w:r>
-      <w:bookmarkEnd w:id="406"/>
+      <w:bookmarkEnd w:id="408"/>
     </w:p>
     <w:p>
       <w:pPr>
@@ -9713,14 +9733,14 @@
       </w:r>
     </w:p>
     <w:p>
-      <w:bookmarkStart w:id="423" w:name="chapter_11"/>
+      <w:bookmarkStart w:id="425" w:name="chapter_11"/>
       <w:pPr>
         <w:pStyle w:val="Heading1"/>
       </w:pPr>
       <w:r>
         <w:t>10 Изменения повторный запуск и отмена</w:t>
       </w:r>
-      <w:bookmarkEnd w:id="423"/>
+      <w:bookmarkEnd w:id="425"/>
     </w:p>
     <w:p>
       <w:pPr>
@@ -10016,14 +10036,14 @@
       </w:r>
     </w:p>
     <w:p>
-      <w:bookmarkStart w:id="472" w:name="chapter_12"/>
+      <w:bookmarkStart w:id="474" w:name="chapter_12"/>
       <w:pPr>
         <w:pStyle w:val="Heading1"/>
       </w:pPr>
       <w:r>
         <w:t>11 Второе упражнение фронтон со скатами</w:t>
       </w:r>
-      <w:bookmarkEnd w:id="472"/>
+      <w:bookmarkEnd w:id="474"/>
     </w:p>
     <w:p>
       <w:pPr>
@@ -10182,14 +10202,14 @@
       </w:r>
     </w:p>
     <w:p>
-      <w:bookmarkStart w:id="488" w:name="chapter_13"/>
+      <w:bookmarkStart w:id="490" w:name="chapter_13"/>
       <w:pPr>
         <w:pStyle w:val="Heading1"/>
       </w:pPr>
       <w:r>
         <w:t>12 ATTILE справочник режимов после первого урока</w:t>
       </w:r>
-      <w:bookmarkEnd w:id="488"/>
+      <w:bookmarkEnd w:id="490"/>
     </w:p>
     <w:p>
       <w:pPr>
@@ -10809,14 +10829,14 @@
       </w:r>
     </w:p>
     <w:p>
-      <w:bookmarkStart w:id="524" w:name="chapter_14"/>
+      <w:bookmarkStart w:id="526" w:name="chapter_14"/>
       <w:pPr>
         <w:pStyle w:val="Heading1"/>
       </w:pPr>
       <w:r>
         <w:t>13 ATFRAME какие режимы выбирать</w:t>
       </w:r>
-      <w:bookmarkEnd w:id="524"/>
+      <w:bookmarkEnd w:id="526"/>
     </w:p>
     <w:p>
       <w:pPr>
@@ -13092,14 +13112,14 @@
       </w:r>
     </w:p>
     <w:p>
-      <w:bookmarkStart w:id="716" w:name="chapter_15"/>
+      <w:bookmarkStart w:id="718" w:name="chapter_15"/>
       <w:pPr>
         <w:pStyle w:val="Heading1"/>
       </w:pPr>
       <w:r>
         <w:t>14 Размеры и поиск дублей</w:t>
       </w:r>
-      <w:bookmarkEnd w:id="716"/>
+      <w:bookmarkEnd w:id="718"/>
     </w:p>
     <w:p>
       <w:r>
@@ -13141,14 +13161,14 @@
       </w:r>
     </w:p>
     <w:p>
-      <w:bookmarkStart w:id="724" w:name="chapter_16"/>
+      <w:bookmarkStart w:id="726" w:name="chapter_16"/>
       <w:pPr>
         <w:pStyle w:val="Heading1"/>
       </w:pPr>
       <w:r>
         <w:t>15 Зачем осталась команда ATCLAD</w:t>
       </w:r>
-      <w:bookmarkEnd w:id="724"/>
+      <w:bookmarkEnd w:id="726"/>
     </w:p>
     <w:p>
       <w:r>
@@ -13166,14 +13186,14 @@
       </w:r>
     </w:p>
     <w:p>
-      <w:bookmarkStart w:id="732" w:name="chapter_17"/>
+      <w:bookmarkStart w:id="734" w:name="chapter_17"/>
       <w:pPr>
         <w:pStyle w:val="Heading1"/>
       </w:pPr>
       <w:r>
         <w:t>16 Частые ошибки что делать по сообщению</w:t>
       </w:r>
-      <w:bookmarkEnd w:id="732"/>
+      <w:bookmarkEnd w:id="734"/>
     </w:p>
     <w:tbl>
       <w:tblPr>
@@ -14183,7 +14203,7 @@
                 <w:color w:val="000000"/>
                 <w:sz w:val="20"/>
               </w:rPr>
-              <w:t>Не удаётся обновить таблицу другим видом подсистемы</w:t>
+              <w:t>«Монтажная принадлежность не определена»</w:t>
             </w:r>
           </w:p>
         </w:tc>
@@ -14208,7 +14228,7 @@
                 <w:color w:val="000000"/>
                 <w:sz w:val="20"/>
               </w:rPr>
-              <w:t>Выбраны «Элементы» вместо «Соединения» либо наоборот</w:t>
+              <w:t>Один кронштейн — кандидат для нескольких отдельных кусков ГП; ошибка монтажа не установлена</w:t>
             </w:r>
           </w:p>
         </w:tc>
@@ -14233,7 +14253,7 @@
                 <w:color w:val="000000"/>
                 <w:sz w:val="20"/>
               </w:rPr>
-              <w:t>Повторить команду с тем же видом, что у целевой таблицы</w:t>
+              <w:t>Сверить ID кронштейна и направляющих из предупреждения с проектным узлом; совпадение не назначает опору</w:t>
             </w:r>
           </w:p>
         </w:tc>
@@ -14263,7 +14283,7 @@
                 <w:color w:val="000000"/>
                 <w:sz w:val="20"/>
               </w:rPr>
-              <w:t>Нет оценки хлыстов</w:t>
+              <w:t>Не удаётся обновить таблицу другим видом подсистемы</w:t>
             </w:r>
           </w:p>
         </w:tc>
@@ -14288,7 +14308,7 @@
                 <w:color w:val="000000"/>
                 <w:sz w:val="20"/>
               </w:rPr>
-              <w:t>Выбрана часть её области либо режим «только кляммеры»</w:t>
+              <w:t>Выбраны «Элементы» вместо «Соединения» либо наоборот</w:t>
             </w:r>
           </w:p>
         </w:tc>
@@ -14313,7 +14333,7 @@
                 <w:color w:val="000000"/>
                 <w:sz w:val="20"/>
               </w:rPr>
-              <w:t>Прочитать объяснение; при необходимости выбрать всю область. Не подменять отсутствие оценки нулём</w:t>
+              <w:t>Повторить команду с тем же видом, что у целевой таблицы</w:t>
             </w:r>
           </w:p>
         </w:tc>
@@ -14343,7 +14363,7 @@
                 <w:color w:val="000000"/>
                 <w:sz w:val="20"/>
               </w:rPr>
-              <w:t>Раскрой требует всю группу зон</w:t>
+              <w:t>Нет оценки хлыстов</w:t>
             </w:r>
           </w:p>
         </w:tc>
@@ -14368,7 +14388,7 @@
                 <w:color w:val="000000"/>
                 <w:sz w:val="20"/>
               </w:rPr>
-              <w:t>Выбрана только часть общей раскладки</w:t>
+              <w:t>Выбрана часть её области либо режим «только кляммеры»</w:t>
             </w:r>
           </w:p>
         </w:tc>
@@ -14393,7 +14413,7 @@
                 <w:color w:val="000000"/>
                 <w:sz w:val="20"/>
               </w:rPr>
-              <w:t>Выбрать всю указанную область либо «Детали» без раскроя</w:t>
+              <w:t>Прочитать объяснение; при необходимости выбрать всю область. Не подменять отсутствие оценки нулём</w:t>
             </w:r>
           </w:p>
         </w:tc>
@@ -14423,7 +14443,7 @@
                 <w:color w:val="000000"/>
                 <w:sz w:val="20"/>
               </w:rPr>
-              <w:t>Скопированная марка или штриховка не принимается</w:t>
+              <w:t>Раскрой требует всю группу зон</w:t>
             </w:r>
           </w:p>
         </w:tc>
@@ -14448,7 +14468,7 @@
                 <w:color w:val="000000"/>
                 <w:sz w:val="20"/>
               </w:rPr>
-              <w:t>COPY не подтверждает актуальность зоны/раскладки</w:t>
+              <w:t>Выбрана только часть общей раскладки</w:t>
             </w:r>
           </w:p>
         </w:tc>
@@ -14473,7 +14493,7 @@
                 <w:color w:val="000000"/>
                 <w:sz w:val="20"/>
               </w:rPr>
-              <w:t>По исходным контурам копии создать собственную зону и повторить цепочку</w:t>
+              <w:t>Выбрать всю указанную область либо «Детали» без раскроя</w:t>
             </w:r>
           </w:p>
         </w:tc>
@@ -14503,7 +14523,7 @@
                 <w:color w:val="000000"/>
                 <w:sz w:val="20"/>
               </w:rPr>
-              <w:t>Две одинаковые марки зоны</w:t>
+              <w:t>Скопированная марка или штриховка не принимается</w:t>
             </w:r>
           </w:p>
         </w:tc>
@@ -14528,7 +14548,7 @@
                 <w:color w:val="000000"/>
                 <w:sz w:val="20"/>
               </w:rPr>
-              <w:t>Повторное создание/копирование без новой идентичности</w:t>
+              <w:t>COPY не подтверждает актуальность зоны/раскладки</w:t>
             </w:r>
           </w:p>
         </w:tc>
@@ -14553,7 +14573,7 @@
                 <w:color w:val="000000"/>
                 <w:sz w:val="20"/>
               </w:rPr>
-              <w:t>Отменить сомнительное действие; назначить самостоятельную зону копии</w:t>
+              <w:t>По исходным контурам копии создать собственную зону и повторить цепочку</w:t>
             </w:r>
           </w:p>
         </w:tc>
@@ -14583,7 +14603,7 @@
                 <w:color w:val="000000"/>
                 <w:sz w:val="20"/>
               </w:rPr>
-              <w:t>В ATTILE рисунок начинается не там</w:t>
+              <w:t>Две одинаковые марки зоны</w:t>
             </w:r>
           </w:p>
         </w:tc>
@@ -14608,7 +14628,7 @@
                 <w:color w:val="000000"/>
                 <w:sz w:val="20"/>
               </w:rPr>
-              <w:t>Изменён отсчёт/общая точка/«основная стена»</w:t>
+              <w:t>Повторное создание/копирование без новой идентичности</w:t>
             </w:r>
           </w:p>
         </w:tc>
@@ -14633,7 +14653,7 @@
                 <w:color w:val="000000"/>
                 <w:sz w:val="20"/>
               </w:rPr>
-              <w:t>Проверить раздел 4 и повторить на одной зоне</w:t>
+              <w:t>Отменить сомнительное действие; назначить самостоятельную зону копии</w:t>
             </w:r>
           </w:p>
         </w:tc>
@@ -14663,7 +14683,7 @@
                 <w:color w:val="000000"/>
                 <w:sz w:val="20"/>
               </w:rPr>
-              <w:t>Цвета образца не совпали</w:t>
+              <w:t>В ATTILE рисунок начинается не там</w:t>
             </w:r>
           </w:p>
         </w:tc>
@@ -14688,7 +14708,7 @@
                 <w:color w:val="000000"/>
                 <w:sz w:val="20"/>
               </w:rPr>
-              <w:t>Типы на разных/неверных слоях, выбрана лишняя графика</w:t>
+              <w:t>Изменён отсчёт/общая точка/«основная стена»</w:t>
             </w:r>
           </w:p>
         </w:tc>
@@ -14713,7 +14733,7 @@
                 <w:color w:val="000000"/>
                 <w:sz w:val="20"/>
               </w:rPr>
-              <w:t>Упростить образец, проверить слои типов, повторить небольшой участок</w:t>
+              <w:t>Проверить раздел 4 и повторить на одной зоне</w:t>
             </w:r>
           </w:p>
         </w:tc>
@@ -14743,7 +14763,7 @@
                 <w:color w:val="000000"/>
                 <w:sz w:val="20"/>
               </w:rPr>
-              <w:t>Очень узкие полоски отсутствуют</w:t>
+              <w:t>Цвета образца не совпали</w:t>
             </w:r>
           </w:p>
         </w:tc>
@@ -14768,7 +14788,7 @@
                 <w:color w:val="000000"/>
                 <w:sz w:val="20"/>
               </w:rPr>
-              <w:t>Сработал порог «не класть куски тоньше»</w:t>
+              <w:t>Типы на разных/неверных слоях, выбрана лишняя графика</w:t>
             </w:r>
           </w:p>
         </w:tc>
@@ -14793,7 +14813,7 @@
                 <w:color w:val="000000"/>
                 <w:sz w:val="20"/>
               </w:rPr>
-              <w:t>Прочитать число исключений; изменить технологию/отсчёт осознанно</w:t>
+              <w:t>Упростить образец, проверить слои типов, повторить небольшой участок</w:t>
             </w:r>
           </w:p>
         </w:tc>
@@ -14823,7 +14843,7 @@
                 <w:color w:val="000000"/>
                 <w:sz w:val="20"/>
               </w:rPr>
-              <w:t>В ATFRAME нет осей раскладки</w:t>
+              <w:t>Очень узкие полоски отсутствуют</w:t>
             </w:r>
           </w:p>
         </w:tc>
@@ -14848,7 +14868,7 @@
                 <w:color w:val="000000"/>
                 <w:sz w:val="20"/>
               </w:rPr>
-              <w:t>Выбрана другая зона или старая метка</w:t>
+              <w:t>Сработал порог «не класть куски тоньше»</w:t>
             </w:r>
           </w:p>
         </w:tc>
@@ -14873,7 +14893,7 @@
                 <w:color w:val="000000"/>
                 <w:sz w:val="20"/>
               </w:rPr>
-              <w:t>Отменить; выполнить ATTILE по правильной зоне, затем ATFRAME</w:t>
+              <w:t>Прочитать число исключений; изменить технологию/отсчёт осознанно</w:t>
             </w:r>
           </w:p>
         </w:tc>
@@ -14903,7 +14923,7 @@
                 <w:color w:val="000000"/>
                 <w:sz w:val="20"/>
               </w:rPr>
-              <w:t>Кляммеров нет у бетонной плитки</w:t>
+              <w:t>В ATFRAME нет осей раскладки</w:t>
             </w:r>
           </w:p>
         </w:tc>
@@ -14928,7 +14948,7 @@
                 <w:color w:val="000000"/>
                 <w:sz w:val="20"/>
               </w:rPr>
-              <w:t>В этом режиме применяются шины</w:t>
+              <w:t>Выбрана другая зона или старая метка</w:t>
             </w:r>
           </w:p>
         </w:tc>
@@ -14953,7 +14973,7 @@
                 <w:color w:val="000000"/>
                 <w:sz w:val="20"/>
               </w:rPr>
-              <w:t>Проверить количество шин; это ожидаемое поведение</w:t>
+              <w:t>Отменить; выполнить ATTILE по правильной зоне, затем ATFRAME</w:t>
             </w:r>
           </w:p>
         </w:tc>
@@ -14983,7 +15003,7 @@
                 <w:color w:val="000000"/>
                 <w:sz w:val="20"/>
               </w:rPr>
-              <w:t>Не удаётся построить шину без опоры</w:t>
+              <w:t>Кляммеров нет у бетонной плитки</w:t>
             </w:r>
           </w:p>
         </w:tc>
@@ -15008,7 +15028,7 @@
                 <w:color w:val="000000"/>
                 <w:sz w:val="20"/>
               </w:rPr>
-              <w:t>Для короткого участка нет направляющей</w:t>
+              <w:t>В этом режиме применяются шины</w:t>
             </w:r>
           </w:p>
         </w:tc>
@@ -15033,7 +15053,7 @@
                 <w:color w:val="000000"/>
                 <w:sz w:val="20"/>
               </w:rPr>
-              <w:t>Проверить координату из сообщения; изменить разбиение/шаг по проекту, пересчитать</w:t>
+              <w:t>Проверить количество шин; это ожидаемое поведение</w:t>
             </w:r>
           </w:p>
         </w:tc>
@@ -15063,7 +15083,7 @@
                 <w:color w:val="000000"/>
                 <w:sz w:val="20"/>
               </w:rPr>
-              <w:t>Межэтажный расчёт недоступен</w:t>
+              <w:t>Не удаётся построить шину без опоры</w:t>
             </w:r>
           </w:p>
         </w:tc>
@@ -15088,7 +15108,7 @@
                 <w:color w:val="000000"/>
                 <w:sz w:val="20"/>
               </w:rPr>
-              <w:t>Статическая модель НСП не подтверждена</w:t>
+              <w:t>Для короткого участка нет направляющей</w:t>
             </w:r>
           </w:p>
         </w:tc>
@@ -15113,7 +15133,7 @@
                 <w:color w:val="000000"/>
                 <w:sz w:val="20"/>
               </w:rPr>
-              <w:t>Передать конструктору; ручную геометрию строить только по отдельному проекту</w:t>
+              <w:t>Проверить координату из сообщения; изменить разбиение/шаг по проекту, пересчитать</w:t>
             </w:r>
           </w:p>
         </w:tc>
@@ -15143,7 +15163,7 @@
                 <w:color w:val="000000"/>
                 <w:sz w:val="20"/>
               </w:rPr>
-              <w:t>Расчёт недоступен для явного каталожного решения</w:t>
+              <w:t>Межэтажный расчёт недоступен</w:t>
             </w:r>
           </w:p>
         </w:tc>
@@ -15168,7 +15188,7 @@
                 <w:color w:val="000000"/>
                 <w:sz w:val="20"/>
               </w:rPr>
-              <w:t>Характеристики выбранной номенклатуры не связаны с подтверждённым расчётом</w:t>
+              <w:t>Статическая модель НСП не подтверждена</w:t>
             </w:r>
           </w:p>
         </w:tc>
@@ -15193,7 +15213,7 @@
                 <w:color w:val="000000"/>
                 <w:sz w:val="20"/>
               </w:rPr>
-              <w:t>Сохранить выбор; согласовать отдельный инженерный проект. Ручной режим не подтверждает прочность</w:t>
+              <w:t>Передать конструктору; ручную геометрию строить только по отдельному проекту</w:t>
             </w:r>
           </w:p>
         </w:tc>
@@ -15223,7 +15243,7 @@
                 <w:color w:val="000000"/>
                 <w:sz w:val="20"/>
               </w:rPr>
-              <w:t>Выбраны зоны с разными решениями</w:t>
+              <w:t>Расчёт недоступен для явного каталожного решения</w:t>
             </w:r>
           </w:p>
         </w:tc>
@@ -15248,7 +15268,7 @@
                 <w:color w:val="000000"/>
                 <w:sz w:val="20"/>
               </w:rPr>
-              <w:t>Один общий выбор не может заменить разные сохранённые решения</w:t>
+              <w:t>Характеристики выбранной номенклатуры не связаны с подтверждённым расчётом</w:t>
             </w:r>
           </w:p>
         </w:tc>
@@ -15273,7 +15293,7 @@
                 <w:color w:val="000000"/>
                 <w:sz w:val="20"/>
               </w:rPr>
-              <w:t>Обработать зоны отдельно; не переносить выбор соседней зоны автоматически</w:t>
+              <w:t>Сохранить выбор; согласовать отдельный инженерный проект. Ручной режим не подтверждает прочность</w:t>
             </w:r>
           </w:p>
         </w:tc>
@@ -15303,7 +15323,7 @@
                 <w:color w:val="000000"/>
                 <w:sz w:val="20"/>
               </w:rPr>
-              <w:t>ATFZONEPARAMS просит сначала ATFPROJECT</w:t>
+              <w:t>Выбраны зоны с разными решениями</w:t>
             </w:r>
           </w:p>
         </w:tc>
@@ -15328,7 +15348,7 @@
                 <w:color w:val="000000"/>
                 <w:sz w:val="20"/>
               </w:rPr>
-              <w:t>В текущем DWG нет явно сохранённого проекта</w:t>
+              <w:t>Один общий выбор не может заменить разные сохранённые решения</w:t>
             </w:r>
           </w:p>
         </w:tc>
@@ -15353,7 +15373,7 @@
                 <w:color w:val="000000"/>
                 <w:sz w:val="20"/>
               </w:rPr>
-              <w:t>Задать полный выбор пилота, проверить изменения и сохранить проект</w:t>
+              <w:t>Обработать зоны отдельно; не переносить выбор соседней зоны автоматически</w:t>
             </w:r>
           </w:p>
         </w:tc>
@@ -15383,7 +15403,7 @@
                 <w:color w:val="000000"/>
                 <w:sz w:val="20"/>
               </w:rPr>
-              <w:t>ATFZONEPARAMS не принимает выбранный объект</w:t>
+              <w:t>ATFZONEPARAMS просит сначала ATFPROJECT</w:t>
             </w:r>
           </w:p>
         </w:tc>
@@ -15408,7 +15428,7 @@
                 <w:color w:val="000000"/>
                 <w:sz w:val="20"/>
               </w:rPr>
-              <w:t>Нужна настоящая актуальная зона ATFZONE</w:t>
+              <w:t>В текущем DWG нет явно сохранённого проекта</w:t>
             </w:r>
           </w:p>
         </w:tc>
@@ -15433,7 +15453,7 @@
                 <w:color w:val="000000"/>
                 <w:sz w:val="20"/>
               </w:rPr>
-              <w:t>Выбрать её штриховку или марку; для копии восстановить собственную зону</w:t>
+              <w:t>Задать полный выбор пилота, проверить изменения и сохранить проект</w:t>
             </w:r>
           </w:p>
         </w:tc>
@@ -15463,7 +15483,7 @@
                 <w:color w:val="000000"/>
                 <w:sz w:val="20"/>
               </w:rPr>
-              <w:t>У зон разные привязки или исключения</w:t>
+              <w:t>ATFZONEPARAMS не принимает выбранный объект</w:t>
             </w:r>
           </w:p>
         </w:tc>
@@ -15488,7 +15508,7 @@
                 <w:color w:val="000000"/>
                 <w:sz w:val="20"/>
               </w:rPr>
-              <w:t>Одно окно не может молча объединить разные местные настройки</w:t>
+              <w:t>Нужна настоящая актуальная зона ATFZONE</w:t>
             </w:r>
           </w:p>
         </w:tc>
@@ -15513,7 +15533,7 @@
                 <w:color w:val="000000"/>
                 <w:sz w:val="20"/>
               </w:rPr>
-              <w:t>Редактировать отдельными группами; проверить флажки «Своё значение»</w:t>
+              <w:t>Выбрать её штриховку или марку; для копии восстановить собственную зону</w:t>
             </w:r>
           </w:p>
         </w:tc>
@@ -15543,7 +15563,7 @@
                 <w:color w:val="000000"/>
                 <w:sz w:val="20"/>
               </w:rPr>
-              <w:t>ATFRAME сообщает о смеси привязанных и непривязанных зон</w:t>
+              <w:t>У зон разные привязки или исключения</w:t>
             </w:r>
           </w:p>
         </w:tc>
@@ -15568,7 +15588,7 @@
                 <w:color w:val="000000"/>
                 <w:sz w:val="20"/>
               </w:rPr>
-              <w:t>Происхождение параметров неоднородно</w:t>
+              <w:t>Одно окно не может молча объединить разные местные настройки</w:t>
             </w:r>
           </w:p>
         </w:tc>
@@ -15593,7 +15613,7 @@
                 <w:color w:val="000000"/>
                 <w:sz w:val="20"/>
               </w:rPr>
-              <w:t>Обработать отдельно либо явно настроить привязки через ATFZONEPARAMS</w:t>
+              <w:t>Редактировать отдельными группами; проверить флажки «Своё значение»</w:t>
             </w:r>
           </w:p>
         </w:tc>
@@ -15623,7 +15643,7 @@
                 <w:color w:val="000000"/>
                 <w:sz w:val="20"/>
               </w:rPr>
-              <w:t>После изменения проекта требуется полное ATFRAME</w:t>
+              <w:t>ATFRAME сообщает о смеси привязанных и непривязанных зон</w:t>
             </w:r>
           </w:p>
         </w:tc>
@@ -15648,7 +15668,7 @@
                 <w:color w:val="000000"/>
                 <w:sz w:val="20"/>
               </w:rPr>
-              <w:t>Сохранённый результат связан с прежней редакцией</w:t>
+              <w:t>Происхождение параметров неоднородно</w:t>
             </w:r>
           </w:p>
         </w:tc>
@@ -15673,7 +15693,7 @@
                 <w:color w:val="000000"/>
                 <w:sz w:val="20"/>
               </w:rPr>
-              <w:t>Выполнить полное построение; обновление только кляммеров не заменяет его</w:t>
+              <w:t>Обработать отдельно либо явно настроить привязки через ATFZONEPARAMS</w:t>
             </w:r>
           </w:p>
         </w:tc>
@@ -15703,7 +15723,7 @@
                 <w:color w:val="000000"/>
                 <w:sz w:val="20"/>
               </w:rPr>
-              <w:t>ATFNODE требует привязанную зону</w:t>
+              <w:t>После изменения проекта требуется полное ATFRAME</w:t>
             </w:r>
           </w:p>
         </w:tc>
@@ -15728,7 +15748,7 @@
                 <w:color w:val="000000"/>
                 <w:sz w:val="20"/>
               </w:rPr>
-              <w:t>Выбранная зона не связана с проектом пилота</w:t>
+              <w:t>Сохранённый результат связан с прежней редакцией</w:t>
             </w:r>
           </w:p>
         </w:tc>
@@ -15753,7 +15773,7 @@
                 <w:color w:val="000000"/>
                 <w:sz w:val="20"/>
               </w:rPr>
-              <w:t>Проверить ATFPROJECT и явно сохранить привязку через ATFZONEPARAMS</w:t>
+              <w:t>Выполнить полное построение; обновление только кляммеров не заменяет его</w:t>
             </w:r>
           </w:p>
         </w:tc>
@@ -15783,7 +15803,7 @@
                 <w:color w:val="000000"/>
                 <w:sz w:val="20"/>
               </w:rPr>
-              <w:t>ATFNODE не принимает единицы чертежа</w:t>
+              <w:t>ATFNODE требует привязанную зону</w:t>
             </w:r>
           </w:p>
         </w:tc>
@@ -15808,7 +15828,7 @@
                 <w:color w:val="000000"/>
                 <w:sz w:val="20"/>
               </w:rPr>
-              <w:t>DWG задан не в миллиметрах</w:t>
+              <w:t>Выбранная зона не связана с проектом пилота</w:t>
             </w:r>
           </w:p>
         </w:tc>
@@ -15833,7 +15853,7 @@
                 <w:color w:val="000000"/>
                 <w:sz w:val="20"/>
               </w:rPr>
-              <w:t>Проверить единицы и фактические размеры; команда не пересчитывает масштаб DWG</w:t>
+              <w:t>Проверить ATFPROJECT и явно сохранить привязку через ATFZONEPARAMS</w:t>
             </w:r>
           </w:p>
         </w:tc>
@@ -15863,7 +15883,7 @@
                 <w:color w:val="000000"/>
                 <w:sz w:val="20"/>
               </w:rPr>
-              <w:t>«ПСК изменилась во время выбора точки»</w:t>
+              <w:t>ATFNODE не принимает единицы чертежа</w:t>
             </w:r>
           </w:p>
         </w:tc>
@@ -15888,7 +15908,7 @@
                 <w:color w:val="000000"/>
                 <w:sz w:val="20"/>
               </w:rPr>
-              <w:t>Система координат изменилась после просмотра</w:t>
+              <w:t>DWG задан не в миллиметрах</w:t>
             </w:r>
           </w:p>
         </w:tc>
@@ -15913,7 +15933,7 @@
                 <w:color w:val="000000"/>
                 <w:sz w:val="20"/>
               </w:rPr>
-              <w:t>Повторить ATFNODE и выбрать точку при неизменной ПСК</w:t>
+              <w:t>Проверить единицы и фактические размеры; команда не пересчитывает масштаб DWG</w:t>
             </w:r>
           </w:p>
         </w:tc>
@@ -15943,7 +15963,7 @@
                 <w:color w:val="000000"/>
                 <w:sz w:val="20"/>
               </w:rPr>
-              <w:t>ATFNODE не даёт вставить схему</w:t>
+              <w:t>«ПСК изменилась во время выбора точки»</w:t>
             </w:r>
           </w:p>
         </w:tc>
@@ -15968,7 +15988,7 @@
                 <w:color w:val="000000"/>
                 <w:sz w:val="20"/>
               </w:rPr>
-              <w:t>Нет известных плоскостей, не определена выбранная поверхность либо есть противоречие</w:t>
+              <w:t>Система координат изменилась после просмотра</w:t>
             </w:r>
           </w:p>
         </w:tc>
@@ -15993,7 +16013,7 @@
                 <w:color w:val="000000"/>
                 <w:sz w:val="20"/>
               </w:rPr>
-              <w:t>Прочитать численный просмотр; задать подтверждённые данные. Неизвестное не заменять нулём</w:t>
+              <w:t>Повторить ATFNODE и выбрать точку при неизменной ПСК</w:t>
             </w:r>
           </w:p>
         </w:tc>
@@ -16023,7 +16043,7 @@
                 <w:color w:val="000000"/>
                 <w:sz w:val="20"/>
               </w:rPr>
-              <w:t>Локальный просвет меньше 20 мм</w:t>
+              <w:t>ATFNODE не даёт вставить схему</w:t>
             </w:r>
           </w:p>
         </w:tc>
@@ -16048,7 +16068,7 @@
                 <w:color w:val="000000"/>
                 <w:sz w:val="20"/>
               </w:rPr>
-              <w:t>Расстояние между заявленными поверхностями не выполняет правило узла 4.2.1</w:t>
+              <w:t>Нет известных плоскостей, не определена выбранная поверхность либо есть противоречие</w:t>
             </w:r>
           </w:p>
         </w:tc>
@@ -16073,7 +16093,7 @@
                 <w:color w:val="000000"/>
                 <w:sz w:val="20"/>
               </w:rPr>
-              <w:t>Проверить исходные координаты и проектное решение; вынос облицовки не заменяет этот просвет</w:t>
+              <w:t>Прочитать численный просмотр; задать подтверждённые данные. Неизвестное не заменять нулём</w:t>
             </w:r>
           </w:p>
         </w:tc>
@@ -16103,7 +16123,7 @@
                 <w:color w:val="000000"/>
                 <w:sz w:val="20"/>
               </w:rPr>
-              <w:t>Снимок ATFNODE неактуален</w:t>
+              <w:t>Локальный просвет меньше 20 мм</w:t>
             </w:r>
           </w:p>
         </w:tc>
@@ -16128,7 +16148,7 @@
                 <w:color w:val="000000"/>
                 <w:sz w:val="20"/>
               </w:rPr>
-              <w:t>Изменились проект, привязка или геометрия зоны</w:t>
+              <w:t>Расстояние между заявленными поверхностями не выполняет правило узла 4.2.1</w:t>
             </w:r>
           </w:p>
         </w:tc>
@@ -16153,7 +16173,7 @@
                 <w:color w:val="000000"/>
                 <w:sz w:val="20"/>
               </w:rPr>
-              <w:t>Проверить текущие параметры и создать новый снимок; старую подпись не считать подтверждением</w:t>
+              <w:t>Проверить исходные координаты и проектное решение; вынос облицовки не заменяет этот просвет</w:t>
             </w:r>
           </w:p>
         </w:tc>
@@ -16183,7 +16203,7 @@
                 <w:color w:val="000000"/>
                 <w:sz w:val="20"/>
               </w:rPr>
-              <w:t>«У выбранного блока нет паспорта ATFNODE»</w:t>
+              <w:t>Снимок ATFNODE неактуален</w:t>
             </w:r>
           </w:p>
         </w:tc>
@@ -16208,7 +16228,7 @@
                 <w:color w:val="000000"/>
                 <w:sz w:val="20"/>
               </w:rPr>
-              <w:t>Выбран обычный блок либо утрачены служебные данные схемы</w:t>
+              <w:t>Изменились проект, привязка или геометрия зоны</w:t>
             </w:r>
           </w:p>
         </w:tc>
@@ -16233,7 +16253,7 @@
                 <w:color w:val="000000"/>
                 <w:sz w:val="20"/>
               </w:rPr>
-              <w:t>Выбрать исходную схему; для новой создать экземпляр через ATFNODE</w:t>
+              <w:t>Проверить текущие параметры и создать новый снимок; старую подпись не считать подтверждением</w:t>
             </w:r>
           </w:p>
         </w:tc>
@@ -16263,7 +16283,7 @@
                 <w:color w:val="000000"/>
                 <w:sz w:val="20"/>
               </w:rPr>
-              <w:t>Проверка ATFNODE отклоняет копию или изменённую схему</w:t>
+              <w:t>«У выбранного блока нет паспорта ATFNODE»</w:t>
             </w:r>
           </w:p>
         </w:tc>
@@ -16288,7 +16308,7 @@
                 <w:color w:val="000000"/>
                 <w:sz w:val="20"/>
               </w:rPr>
-              <w:t>COPY, масштабирование, повреждение записи либо ручная правка содержимого</w:t>
+              <w:t>Выбран обычный блок либо утрачены служебные данные схемы</w:t>
             </w:r>
           </w:p>
         </w:tc>
@@ -16313,7 +16333,7 @@
                 <w:color w:val="000000"/>
                 <w:sz w:val="20"/>
               </w:rPr>
-              <w:t>Создать отдельный проверяемый экземпляр через ATFNODE; сохранить проблемный для диагностики</w:t>
+              <w:t>Выбрать исходную схему; для новой создать экземпляр через ATFNODE</w:t>
             </w:r>
           </w:p>
         </w:tc>
@@ -16343,7 +16363,7 @@
                 <w:color w:val="000000"/>
                 <w:sz w:val="20"/>
               </w:rPr>
-              <w:t>Решение нельзя изменить при повторе только кляммеров</w:t>
+              <w:t>Проверка ATFNODE отклоняет копию или изменённую схему</w:t>
             </w:r>
           </w:p>
         </w:tc>
@@ -16368,7 +16388,7 @@
                 <w:color w:val="000000"/>
                 <w:sz w:val="20"/>
               </w:rPr>
-              <w:t>Направляющие и кронштейны сохраняются</w:t>
+              <w:t>COPY, масштабирование, повреждение записи либо ручная правка содержимого</w:t>
             </w:r>
           </w:p>
         </w:tc>
@@ -16393,7 +16413,7 @@
                 <w:color w:val="000000"/>
                 <w:sz w:val="20"/>
               </w:rPr>
-              <w:t>Вернуться к полному перестроению по согласованному проекту</w:t>
+              <w:t>Создать отдельный проверяемый экземпляр через ATFNODE; сохранить проблемный для диагностики</w:t>
             </w:r>
           </w:p>
         </w:tc>
@@ -16423,7 +16443,7 @@
                 <w:color w:val="000000"/>
                 <w:sz w:val="20"/>
               </w:rPr>
-              <w:t>Расчёт отклонён из-за опор или пролётов</w:t>
+              <w:t>Решение нельзя изменить при повторе только кляммеров</w:t>
             </w:r>
           </w:p>
         </w:tc>
@@ -16448,7 +16468,7 @@
                 <w:color w:val="000000"/>
                 <w:sz w:val="20"/>
               </w:rPr>
-              <w:t>Отдельный кусок не соответствует принятой модели</w:t>
+              <w:t>Направляющие и кронштейны сохраняются</w:t>
             </w:r>
           </w:p>
         </w:tc>
@@ -16473,7 +16493,7 @@
                 <w:color w:val="000000"/>
                 <w:sz w:val="20"/>
               </w:rPr>
-              <w:t>Проверить опоры, проёмы и стыки с конструктором; не подбирать параметры ради снятия отказа</w:t>
+              <w:t>Вернуться к полному перестроению по согласованному проекту</w:t>
             </w:r>
           </w:p>
         </w:tc>
@@ -16503,7 +16523,7 @@
                 <w:color w:val="000000"/>
                 <w:sz w:val="20"/>
               </w:rPr>
-              <w:t>Композит с кляммерами не принимается</w:t>
+              <w:t>Расчёт отклонён из-за опор или пролётов</w:t>
             </w:r>
           </w:p>
         </w:tc>
@@ -16528,7 +16548,7 @@
                 <w:color w:val="000000"/>
                 <w:sz w:val="20"/>
               </w:rPr>
-              <w:t>Неподходящий состав крепления</w:t>
+              <w:t>Отдельный кусок не соответствует принятой модели</w:t>
             </w:r>
           </w:p>
         </w:tc>
@@ -16553,7 +16573,7 @@
                 <w:color w:val="000000"/>
                 <w:sz w:val="20"/>
               </w:rPr>
-              <w:t>Выбрать «только подсистему» и проектное решение крепления</w:t>
+              <w:t>Проверить опоры, проёмы и стыки с конструктором; не подбирать параметры ради снятия отказа</w:t>
             </w:r>
           </w:p>
         </w:tc>
@@ -16583,7 +16603,7 @@
                 <w:color w:val="000000"/>
                 <w:sz w:val="20"/>
               </w:rPr>
-              <w:t>Таблица слишком большая</w:t>
+              <w:t>Композит с кляммерами не принимается</w:t>
             </w:r>
           </w:p>
         </w:tc>
@@ -16608,7 +16628,7 @@
                 <w:color w:val="000000"/>
                 <w:sz w:val="20"/>
               </w:rPr>
-              <w:t>Высота текста задана в единицах модели</w:t>
+              <w:t>Неподходящий состав крепления</w:t>
             </w:r>
           </w:p>
         </w:tc>
@@ -16633,7 +16653,7 @@
                 <w:color w:val="000000"/>
                 <w:sz w:val="20"/>
               </w:rPr>
-              <w:t>Перестроить таблицу с меньшей высотой текста; контуры не масштабировать</w:t>
+              <w:t>Выбрать «только подсистему» и проектное решение крепления</w:t>
             </w:r>
           </w:p>
         </w:tc>
@@ -16663,7 +16683,7 @@
                 <w:color w:val="000000"/>
                 <w:sz w:val="20"/>
               </w:rPr>
-              <w:t>После Save As не найдены зоны</w:t>
+              <w:t>Таблица слишком большая</w:t>
             </w:r>
           </w:p>
         </w:tc>
@@ -16688,7 +16708,7 @@
                 <w:color w:val="000000"/>
                 <w:sz w:val="20"/>
               </w:rPr>
-              <w:t>Отдельный JSON не перенесён/не соответствует DWG</w:t>
+              <w:t>Высота текста задана в единицах модели</w:t>
             </w:r>
           </w:p>
         </w:tc>
@@ -16713,7 +16733,7 @@
                 <w:color w:val="000000"/>
                 <w:sz w:val="20"/>
               </w:rPr>
-              <w:t>Проверить пару файлов и пересчитать/сохранить зоны в новой папке</w:t>
+              <w:t>Перестроить таблицу с меньшей высотой текста; контуры не масштабировать</w:t>
             </w:r>
           </w:p>
         </w:tc>
@@ -16743,7 +16763,7 @@
                 <w:color w:val="000000"/>
                 <w:sz w:val="20"/>
               </w:rPr>
-              <w:t>Вставка идёт долго</w:t>
+              <w:t>После Save As не найдены зоны</w:t>
             </w:r>
           </w:p>
         </w:tc>
@@ -16768,7 +16788,7 @@
                 <w:color w:val="000000"/>
                 <w:sz w:val="20"/>
               </w:rPr>
-              <w:t>Большая зона, много разных подрезок или сложные блоки</w:t>
+              <w:t>Отдельный JSON не перенесён/не соответствует DWG</w:t>
             </w:r>
           </w:p>
         </w:tc>
@@ -16793,7 +16813,7 @@
                 <w:color w:val="000000"/>
                 <w:sz w:val="20"/>
               </w:rPr>
-              <w:t>Дождаться сообщения завершения; первый тест делать на небольшом участке</w:t>
+              <w:t>Проверить пару файлов и пересчитать/сохранить зоны в новой папке</w:t>
             </w:r>
           </w:p>
         </w:tc>
@@ -16823,7 +16843,7 @@
                 <w:color w:val="000000"/>
                 <w:sz w:val="20"/>
               </w:rPr>
-              <w:t>Старая схема линий, предложен ATFZONERESET</w:t>
+              <w:t>Вставка идёт долго</w:t>
             </w:r>
           </w:p>
         </w:tc>
@@ -16848,7 +16868,7 @@
                 <w:color w:val="000000"/>
                 <w:sz w:val="20"/>
               </w:rPr>
-              <w:t>У старых объектов нет безопасных связей</w:t>
+              <w:t>Большая зона, много разных подрезок или сложные блоки</w:t>
             </w:r>
           </w:p>
         </w:tc>
@@ -16873,7 +16893,7 @@
                 <w:color w:val="000000"/>
                 <w:sz w:val="20"/>
               </w:rPr>
-              <w:t>Выполнить главу 10.4 на контрольной копии, выбрать только свой участок</w:t>
+              <w:t>Дождаться сообщения завершения; первый тест делать на небольшом участке</w:t>
             </w:r>
           </w:p>
         </w:tc>
@@ -16903,6 +16923,86 @@
                 <w:color w:val="000000"/>
                 <w:sz w:val="20"/>
               </w:rPr>
+              <w:t>Старая схема линий, предложен ATFZONERESET</w:t>
+            </w:r>
+          </w:p>
+        </w:tc>
+        <w:tc>
+          <w:tcPr>
+            <w:tcW w:type="dxa" w:w="3581"/>
+            <w:vAlign w:val="center"/>
+            <w:tcMar>
+              <w:top w:w="85" w:type="dxa"/>
+              <w:bottom w:w="85" w:type="dxa"/>
+              <w:left w:w="100" w:type="dxa"/>
+              <w:right w:w="100" w:type="dxa"/>
+            </w:tcMar>
+            <w:shd w:fill="F1F5F7"/>
+          </w:tcPr>
+          <w:p>
+            <w:pPr>
+              <w:spacing w:after="0" w:before="0" w:line="259" w:lineRule="auto"/>
+            </w:pPr>
+            <w:r>
+              <w:rPr>
+                <w:color w:val="000000"/>
+                <w:sz w:val="20"/>
+              </w:rPr>
+              <w:t>У старых объектов нет безопасных связей</w:t>
+            </w:r>
+          </w:p>
+        </w:tc>
+        <w:tc>
+          <w:tcPr>
+            <w:tcW w:type="dxa" w:w="3581"/>
+            <w:vAlign w:val="center"/>
+            <w:tcMar>
+              <w:top w:w="85" w:type="dxa"/>
+              <w:bottom w:w="85" w:type="dxa"/>
+              <w:left w:w="100" w:type="dxa"/>
+              <w:right w:w="100" w:type="dxa"/>
+            </w:tcMar>
+            <w:shd w:fill="F1F5F7"/>
+          </w:tcPr>
+          <w:p>
+            <w:pPr>
+              <w:spacing w:after="0" w:before="0" w:line="259" w:lineRule="auto"/>
+            </w:pPr>
+            <w:r>
+              <w:rPr>
+                <w:color w:val="000000"/>
+                <w:sz w:val="20"/>
+              </w:rPr>
+              <w:t>Выполнить главу 10.4 на контрольной копии, выбрать только свой участок</w:t>
+            </w:r>
+          </w:p>
+        </w:tc>
+      </w:tr>
+      <w:tr>
+        <w:trPr>
+          <w:cantSplit/>
+        </w:trPr>
+        <w:tc>
+          <w:tcPr>
+            <w:tcW w:type="dxa" w:w="2919"/>
+            <w:vAlign w:val="center"/>
+            <w:tcMar>
+              <w:top w:w="85" w:type="dxa"/>
+              <w:bottom w:w="85" w:type="dxa"/>
+              <w:left w:w="100" w:type="dxa"/>
+              <w:right w:w="100" w:type="dxa"/>
+            </w:tcMar>
+            <w:shd w:fill="FFFFFF"/>
+          </w:tcPr>
+          <w:p>
+            <w:pPr>
+              <w:spacing w:after="0" w:before="0" w:line="259" w:lineRule="auto"/>
+            </w:pPr>
+            <w:r>
+              <w:rPr>
+                <w:color w:val="000000"/>
+                <w:sz w:val="20"/>
+              </w:rPr>
               <w:t>Внутренняя ошибка</w:t>
             </w:r>
           </w:p>
@@ -16917,7 +17017,7 @@
               <w:left w:w="100" w:type="dxa"/>
               <w:right w:w="100" w:type="dxa"/>
             </w:tcMar>
-            <w:shd w:fill="F1F5F7"/>
+            <w:shd w:fill="FFFFFF"/>
           </w:tcPr>
           <w:p>
             <w:pPr>
@@ -16942,7 +17042,7 @@
               <w:left w:w="100" w:type="dxa"/>
               <w:right w:w="100" w:type="dxa"/>
             </w:tcMar>
-            <w:shd w:fill="F1F5F7"/>
+            <w:shd w:fill="FFFFFF"/>
           </w:tcPr>
           <w:p>
             <w:pPr>
@@ -16965,14 +17065,14 @@
       </w:pPr>
     </w:p>
     <w:p>
-      <w:bookmarkStart w:id="783" w:name="chapter_18"/>
+      <w:bookmarkStart w:id="786" w:name="chapter_18"/>
       <w:pPr>
         <w:pStyle w:val="Heading1"/>
       </w:pPr>
       <w:r>
         <w:t>17 Сохранение и передача результата</w:t>
       </w:r>
-      <w:bookmarkEnd w:id="783"/>
+      <w:bookmarkEnd w:id="786"/>
     </w:p>
     <w:p>
       <w:r>
@@ -17073,14 +17173,14 @@
       </w:r>
     </w:p>
     <w:p>
-      <w:bookmarkStart w:id="797" w:name="chapter_19"/>
+      <w:bookmarkStart w:id="800" w:name="chapter_19"/>
       <w:pPr>
         <w:pStyle w:val="Heading1"/>
       </w:pPr>
       <w:r>
         <w:t>18 Как сообщить о проблеме чтобы её можно было исправить</w:t>
       </w:r>
-      <w:bookmarkEnd w:id="797"/>
+      <w:bookmarkEnd w:id="800"/>
     </w:p>
     <w:p>
       <w:r>
@@ -17093,14 +17193,14 @@
       </w:r>
     </w:p>
     <w:p>
-      <w:bookmarkStart w:id="803" w:name="chapter_20"/>
+      <w:bookmarkStart w:id="806" w:name="chapter_20"/>
       <w:pPr>
         <w:pStyle w:val="Heading1"/>
       </w:pPr>
       <w:r>
         <w:t>19 Словарь начинающего пользователя</w:t>
       </w:r>
-      <w:bookmarkEnd w:id="803"/>
+      <w:bookmarkEnd w:id="806"/>
     </w:p>
     <w:tbl>
       <w:tblPr>
@@ -18890,14 +18990,14 @@
       </w:pPr>
     </w:p>
     <w:p>
-      <w:bookmarkStart w:id="839" w:name="chapter_21"/>
+      <w:bookmarkStart w:id="842" w:name="chapter_21"/>
       <w:pPr>
         <w:pStyle w:val="Heading1"/>
       </w:pPr>
       <w:r>
         <w:t>20 Финальная самопроверка первого урока</w:t>
       </w:r>
-      <w:bookmarkEnd w:id="839"/>
+      <w:bookmarkEnd w:id="842"/>
     </w:p>
     <w:p>
       <w:r>

</xml_diff>